<commit_message>
Pha workshop 3 and ECO5007 workshop 3
</commit_message>
<xml_diff>
--- a/courses/pha/4/docs/Pharmacy Calculations LET 2 Solutions.docx
+++ b/courses/pha/4/docs/Pharmacy Calculations LET 2 Solutions.docx
@@ -6,70 +6,12 @@
       <w:pPr>
         <w:pStyle w:val="Heading1"/>
         <w:spacing w:line="360" w:lineRule="auto"/>
-        <w:ind w:firstLine="720"/>
-      </w:pPr>
-      <w:r>
-        <w:rPr>
-          <w:noProof/>
-        </w:rPr>
-        <w:drawing>
-          <wp:anchor distT="0" distB="0" distL="0" distR="0" simplePos="0" relativeHeight="251659264" behindDoc="0" locked="0" layoutInCell="1" hidden="0" allowOverlap="1" wp14:anchorId="7FDBBD72" wp14:editId="75231B01">
-            <wp:simplePos x="0" y="0"/>
-            <wp:positionH relativeFrom="column">
-              <wp:posOffset>5592445</wp:posOffset>
-            </wp:positionH>
-            <wp:positionV relativeFrom="page">
-              <wp:posOffset>360045</wp:posOffset>
-            </wp:positionV>
-            <wp:extent cx="914400" cy="760730"/>
-            <wp:effectExtent l="0" t="0" r="0" b="1270"/>
-            <wp:wrapSquare wrapText="bothSides" distT="0" distB="0" distL="0" distR="0"/>
-            <wp:docPr id="12" name="image3.jpg">
-              <a:extLst xmlns:a="http://schemas.openxmlformats.org/drawingml/2006/main">
-                <a:ext uri="{C183D7F6-B498-43B3-948B-1728B52AA6E4}">
-                  <adec:decorative xmlns:adec="http://schemas.microsoft.com/office/drawing/2017/decorative" val="1"/>
-                </a:ext>
-              </a:extLst>
-            </wp:docPr>
-            <wp:cNvGraphicFramePr/>
-            <a:graphic xmlns:a="http://schemas.openxmlformats.org/drawingml/2006/main">
-              <a:graphicData uri="http://schemas.openxmlformats.org/drawingml/2006/picture">
-                <pic:pic xmlns:pic="http://schemas.openxmlformats.org/drawingml/2006/picture">
-                  <pic:nvPicPr>
-                    <pic:cNvPr id="0" name="image3.jpg"/>
-                    <pic:cNvPicPr preferRelativeResize="0"/>
-                  </pic:nvPicPr>
-                  <pic:blipFill>
-                    <a:blip r:embed="rId10"/>
-                    <a:srcRect/>
-                    <a:stretch>
-                      <a:fillRect/>
-                    </a:stretch>
-                  </pic:blipFill>
-                  <pic:spPr>
-                    <a:xfrm>
-                      <a:off x="0" y="0"/>
-                      <a:ext cx="914400" cy="760730"/>
-                    </a:xfrm>
-                    <a:prstGeom prst="rect">
-                      <a:avLst/>
-                    </a:prstGeom>
-                    <a:ln/>
-                  </pic:spPr>
-                </pic:pic>
-              </a:graphicData>
-            </a:graphic>
-          </wp:anchor>
-        </w:drawing>
-      </w:r>
-      <w:r>
+        <w:ind w:firstLine="0"/>
+      </w:pPr>
+      <w:r>
+        <w:rPr/>
         <w:t>Learning Enhancement Team – Mathematics &amp; Statistics</w:t>
       </w:r>
-    </w:p>
-    <w:p>
-      <w:pPr>
-        <w:spacing w:line="360" w:lineRule="auto"/>
-      </w:pPr>
     </w:p>
     <w:p>
       <w:pPr>
@@ -2907,7 +2849,7 @@
         <m:oMath>
           <m:r>
             <w:rPr>
-              <w:rFonts w:ascii="Cambria Math" w:eastAsiaTheme="minorEastAsia" w:hAnsi="Cambria Math"/>
+              <w:rFonts w:ascii="Cambria Math" w:hAnsi="Cambria Math" w:eastAsiaTheme="minorEastAsia"/>
               <w:sz w:val="28"/>
               <w:szCs w:val="28"/>
             </w:rPr>
@@ -2917,7 +2859,7 @@
             <m:fPr>
               <m:ctrlPr>
                 <w:rPr>
-                  <w:rFonts w:ascii="Cambria Math" w:eastAsiaTheme="minorEastAsia" w:hAnsi="Cambria Math"/>
+                  <w:rFonts w:ascii="Cambria Math" w:hAnsi="Cambria Math" w:eastAsiaTheme="minorEastAsia"/>
                   <w:i/>
                   <w:sz w:val="28"/>
                   <w:szCs w:val="28"/>
@@ -2927,7 +2869,7 @@
             <m:num>
               <m:r>
                 <w:rPr>
-                  <w:rFonts w:ascii="Cambria Math" w:eastAsiaTheme="minorEastAsia" w:hAnsi="Cambria Math"/>
+                  <w:rFonts w:ascii="Cambria Math" w:hAnsi="Cambria Math" w:eastAsiaTheme="minorEastAsia"/>
                   <w:sz w:val="28"/>
                   <w:szCs w:val="28"/>
                 </w:rPr>
@@ -2937,7 +2879,7 @@
             <m:den>
               <m:r>
                 <w:rPr>
-                  <w:rFonts w:ascii="Cambria Math" w:eastAsiaTheme="minorEastAsia" w:hAnsi="Cambria Math"/>
+                  <w:rFonts w:ascii="Cambria Math" w:hAnsi="Cambria Math" w:eastAsiaTheme="minorEastAsia"/>
                   <w:sz w:val="28"/>
                   <w:szCs w:val="28"/>
                 </w:rPr>
@@ -2947,7 +2889,7 @@
           </m:f>
           <m:r>
             <w:rPr>
-              <w:rFonts w:ascii="Cambria Math" w:eastAsiaTheme="minorEastAsia" w:hAnsi="Cambria Math"/>
+              <w:rFonts w:ascii="Cambria Math" w:hAnsi="Cambria Math" w:eastAsiaTheme="minorEastAsia"/>
               <w:sz w:val="28"/>
               <w:szCs w:val="28"/>
             </w:rPr>
@@ -2957,7 +2899,7 @@
             <m:fPr>
               <m:ctrlPr>
                 <w:rPr>
-                  <w:rFonts w:ascii="Cambria Math" w:eastAsiaTheme="minorEastAsia" w:hAnsi="Cambria Math"/>
+                  <w:rFonts w:ascii="Cambria Math" w:hAnsi="Cambria Math" w:eastAsiaTheme="minorEastAsia"/>
                   <w:i/>
                   <w:sz w:val="28"/>
                   <w:szCs w:val="28"/>
@@ -2967,7 +2909,7 @@
             <m:num>
               <m:r>
                 <w:rPr>
-                  <w:rFonts w:ascii="Cambria Math" w:eastAsiaTheme="minorEastAsia" w:hAnsi="Cambria Math"/>
+                  <w:rFonts w:ascii="Cambria Math" w:hAnsi="Cambria Math" w:eastAsiaTheme="minorEastAsia"/>
                   <w:sz w:val="28"/>
                   <w:szCs w:val="28"/>
                 </w:rPr>
@@ -2977,7 +2919,7 @@
             <m:den>
               <m:r>
                 <w:rPr>
-                  <w:rFonts w:ascii="Cambria Math" w:eastAsiaTheme="minorEastAsia" w:hAnsi="Cambria Math"/>
+                  <w:rFonts w:ascii="Cambria Math" w:hAnsi="Cambria Math" w:eastAsiaTheme="minorEastAsia"/>
                   <w:sz w:val="28"/>
                   <w:szCs w:val="28"/>
                 </w:rPr>
@@ -2987,7 +2929,7 @@
           </m:f>
           <m:r>
             <w:rPr>
-              <w:rFonts w:ascii="Cambria Math" w:eastAsiaTheme="minorEastAsia" w:hAnsi="Cambria Math"/>
+              <w:rFonts w:ascii="Cambria Math" w:hAnsi="Cambria Math" w:eastAsiaTheme="minorEastAsia"/>
               <w:sz w:val="28"/>
               <w:szCs w:val="28"/>
             </w:rPr>
@@ -2998,7 +2940,7 @@
               <m:sty m:val="bi"/>
             </m:rPr>
             <w:rPr>
-              <w:rFonts w:ascii="Cambria Math" w:eastAsiaTheme="minorEastAsia" w:hAnsi="Cambria Math"/>
+              <w:rFonts w:ascii="Cambria Math" w:hAnsi="Cambria Math" w:eastAsiaTheme="minorEastAsia"/>
               <w:sz w:val="28"/>
               <w:szCs w:val="28"/>
             </w:rPr>
@@ -3009,7 +2951,7 @@
               <m:nor/>
             </m:rPr>
             <w:rPr>
-              <w:rFonts w:ascii="Cambria Math" w:eastAsiaTheme="minorEastAsia" w:hAnsi="Cambria Math"/>
+              <w:rFonts w:ascii="Cambria Math" w:hAnsi="Cambria Math" w:eastAsiaTheme="minorEastAsia"/>
               <w:b/>
               <w:bCs/>
               <w:sz w:val="28"/>
@@ -3198,7 +3140,7 @@
         <m:oMath>
           <m:r>
             <w:rPr>
-              <w:rFonts w:ascii="Cambria Math" w:eastAsiaTheme="minorEastAsia" w:hAnsi="Cambria Math"/>
+              <w:rFonts w:ascii="Cambria Math" w:hAnsi="Cambria Math" w:eastAsiaTheme="minorEastAsia"/>
               <w:sz w:val="28"/>
               <w:szCs w:val="28"/>
             </w:rPr>
@@ -3220,7 +3162,7 @@
         <m:oMath>
           <m:r>
             <w:rPr>
-              <w:rFonts w:ascii="Cambria Math" w:eastAsiaTheme="minorEastAsia" w:hAnsi="Cambria Math"/>
+              <w:rFonts w:ascii="Cambria Math" w:hAnsi="Cambria Math" w:eastAsiaTheme="minorEastAsia"/>
               <w:sz w:val="28"/>
               <w:szCs w:val="28"/>
             </w:rPr>
@@ -3230,7 +3172,7 @@
             <m:fPr>
               <m:ctrlPr>
                 <w:rPr>
-                  <w:rFonts w:ascii="Cambria Math" w:eastAsiaTheme="minorEastAsia" w:hAnsi="Cambria Math"/>
+                  <w:rFonts w:ascii="Cambria Math" w:hAnsi="Cambria Math" w:eastAsiaTheme="minorEastAsia"/>
                   <w:i/>
                   <w:sz w:val="28"/>
                   <w:szCs w:val="28"/>
@@ -3240,7 +3182,7 @@
             <m:num>
               <m:r>
                 <w:rPr>
-                  <w:rFonts w:ascii="Cambria Math" w:eastAsiaTheme="minorEastAsia" w:hAnsi="Cambria Math"/>
+                  <w:rFonts w:ascii="Cambria Math" w:hAnsi="Cambria Math" w:eastAsiaTheme="minorEastAsia"/>
                   <w:sz w:val="28"/>
                   <w:szCs w:val="28"/>
                 </w:rPr>
@@ -3250,7 +3192,7 @@
             <m:den>
               <m:r>
                 <w:rPr>
-                  <w:rFonts w:ascii="Cambria Math" w:eastAsiaTheme="minorEastAsia" w:hAnsi="Cambria Math"/>
+                  <w:rFonts w:ascii="Cambria Math" w:hAnsi="Cambria Math" w:eastAsiaTheme="minorEastAsia"/>
                   <w:sz w:val="28"/>
                   <w:szCs w:val="28"/>
                 </w:rPr>
@@ -3260,7 +3202,7 @@
           </m:f>
           <m:r>
             <w:rPr>
-              <w:rFonts w:ascii="Cambria Math" w:eastAsiaTheme="minorEastAsia" w:hAnsi="Cambria Math"/>
+              <w:rFonts w:ascii="Cambria Math" w:hAnsi="Cambria Math" w:eastAsiaTheme="minorEastAsia"/>
               <w:sz w:val="28"/>
               <w:szCs w:val="28"/>
             </w:rPr>
@@ -3270,7 +3212,7 @@
             <m:fPr>
               <m:ctrlPr>
                 <w:rPr>
-                  <w:rFonts w:ascii="Cambria Math" w:eastAsiaTheme="minorEastAsia" w:hAnsi="Cambria Math"/>
+                  <w:rFonts w:ascii="Cambria Math" w:hAnsi="Cambria Math" w:eastAsiaTheme="minorEastAsia"/>
                   <w:i/>
                   <w:sz w:val="28"/>
                   <w:szCs w:val="28"/>
@@ -3280,7 +3222,7 @@
             <m:num>
               <m:r>
                 <w:rPr>
-                  <w:rFonts w:ascii="Cambria Math" w:eastAsiaTheme="minorEastAsia" w:hAnsi="Cambria Math"/>
+                  <w:rFonts w:ascii="Cambria Math" w:hAnsi="Cambria Math" w:eastAsiaTheme="minorEastAsia"/>
                   <w:sz w:val="28"/>
                   <w:szCs w:val="28"/>
                 </w:rPr>
@@ -3290,7 +3232,7 @@
             <m:den>
               <m:r>
                 <w:rPr>
-                  <w:rFonts w:ascii="Cambria Math" w:eastAsiaTheme="minorEastAsia" w:hAnsi="Cambria Math"/>
+                  <w:rFonts w:ascii="Cambria Math" w:hAnsi="Cambria Math" w:eastAsiaTheme="minorEastAsia"/>
                   <w:sz w:val="28"/>
                   <w:szCs w:val="28"/>
                 </w:rPr>
@@ -3300,7 +3242,7 @@
           </m:f>
           <m:r>
             <w:rPr>
-              <w:rFonts w:ascii="Cambria Math" w:eastAsiaTheme="minorEastAsia" w:hAnsi="Cambria Math"/>
+              <w:rFonts w:ascii="Cambria Math" w:hAnsi="Cambria Math" w:eastAsiaTheme="minorEastAsia"/>
               <w:sz w:val="28"/>
               <w:szCs w:val="28"/>
             </w:rPr>
@@ -3311,7 +3253,7 @@
               <m:sty m:val="bi"/>
             </m:rPr>
             <w:rPr>
-              <w:rFonts w:ascii="Cambria Math" w:eastAsiaTheme="minorEastAsia" w:hAnsi="Cambria Math"/>
+              <w:rFonts w:ascii="Cambria Math" w:hAnsi="Cambria Math" w:eastAsiaTheme="minorEastAsia"/>
               <w:sz w:val="28"/>
               <w:szCs w:val="28"/>
             </w:rPr>
@@ -3322,7 +3264,7 @@
               <m:nor/>
             </m:rPr>
             <w:rPr>
-              <w:rFonts w:ascii="Cambria Math" w:eastAsiaTheme="minorEastAsia" w:hAnsi="Cambria Math"/>
+              <w:rFonts w:ascii="Cambria Math" w:hAnsi="Cambria Math" w:eastAsiaTheme="minorEastAsia"/>
               <w:b/>
               <w:bCs/>
               <w:sz w:val="28"/>
@@ -3418,7 +3360,7 @@
         <m:oMath>
           <m:r>
             <w:rPr>
-              <w:rFonts w:ascii="Cambria Math" w:eastAsiaTheme="minorEastAsia" w:hAnsi="Cambria Math"/>
+              <w:rFonts w:ascii="Cambria Math" w:hAnsi="Cambria Math" w:eastAsiaTheme="minorEastAsia"/>
               <w:sz w:val="28"/>
               <w:szCs w:val="28"/>
             </w:rPr>
@@ -3440,7 +3382,7 @@
         <m:oMath>
           <m:r>
             <w:rPr>
-              <w:rFonts w:ascii="Cambria Math" w:eastAsiaTheme="minorEastAsia" w:hAnsi="Cambria Math"/>
+              <w:rFonts w:ascii="Cambria Math" w:hAnsi="Cambria Math" w:eastAsiaTheme="minorEastAsia"/>
               <w:sz w:val="28"/>
               <w:szCs w:val="28"/>
             </w:rPr>
@@ -3450,7 +3392,7 @@
             <m:fPr>
               <m:ctrlPr>
                 <w:rPr>
-                  <w:rFonts w:ascii="Cambria Math" w:eastAsiaTheme="minorEastAsia" w:hAnsi="Cambria Math"/>
+                  <w:rFonts w:ascii="Cambria Math" w:hAnsi="Cambria Math" w:eastAsiaTheme="minorEastAsia"/>
                   <w:i/>
                   <w:sz w:val="28"/>
                   <w:szCs w:val="28"/>
@@ -3460,7 +3402,7 @@
             <m:num>
               <m:r>
                 <w:rPr>
-                  <w:rFonts w:ascii="Cambria Math" w:eastAsiaTheme="minorEastAsia" w:hAnsi="Cambria Math"/>
+                  <w:rFonts w:ascii="Cambria Math" w:hAnsi="Cambria Math" w:eastAsiaTheme="minorEastAsia"/>
                   <w:sz w:val="28"/>
                   <w:szCs w:val="28"/>
                 </w:rPr>
@@ -3470,7 +3412,7 @@
             <m:den>
               <m:r>
                 <w:rPr>
-                  <w:rFonts w:ascii="Cambria Math" w:eastAsiaTheme="minorEastAsia" w:hAnsi="Cambria Math"/>
+                  <w:rFonts w:ascii="Cambria Math" w:hAnsi="Cambria Math" w:eastAsiaTheme="minorEastAsia"/>
                   <w:sz w:val="28"/>
                   <w:szCs w:val="28"/>
                 </w:rPr>
@@ -3480,7 +3422,7 @@
           </m:f>
           <m:r>
             <w:rPr>
-              <w:rFonts w:ascii="Cambria Math" w:eastAsiaTheme="minorEastAsia" w:hAnsi="Cambria Math"/>
+              <w:rFonts w:ascii="Cambria Math" w:hAnsi="Cambria Math" w:eastAsiaTheme="minorEastAsia"/>
               <w:sz w:val="28"/>
               <w:szCs w:val="28"/>
             </w:rPr>
@@ -3490,7 +3432,7 @@
             <m:fPr>
               <m:ctrlPr>
                 <w:rPr>
-                  <w:rFonts w:ascii="Cambria Math" w:eastAsiaTheme="minorEastAsia" w:hAnsi="Cambria Math"/>
+                  <w:rFonts w:ascii="Cambria Math" w:hAnsi="Cambria Math" w:eastAsiaTheme="minorEastAsia"/>
                   <w:i/>
                   <w:sz w:val="28"/>
                   <w:szCs w:val="28"/>
@@ -3500,7 +3442,7 @@
             <m:num>
               <m:r>
                 <w:rPr>
-                  <w:rFonts w:ascii="Cambria Math" w:eastAsiaTheme="minorEastAsia" w:hAnsi="Cambria Math"/>
+                  <w:rFonts w:ascii="Cambria Math" w:hAnsi="Cambria Math" w:eastAsiaTheme="minorEastAsia"/>
                   <w:sz w:val="28"/>
                   <w:szCs w:val="28"/>
                 </w:rPr>
@@ -3510,7 +3452,7 @@
             <m:den>
               <m:r>
                 <w:rPr>
-                  <w:rFonts w:ascii="Cambria Math" w:eastAsiaTheme="minorEastAsia" w:hAnsi="Cambria Math"/>
+                  <w:rFonts w:ascii="Cambria Math" w:hAnsi="Cambria Math" w:eastAsiaTheme="minorEastAsia"/>
                   <w:sz w:val="28"/>
                   <w:szCs w:val="28"/>
                 </w:rPr>
@@ -3520,7 +3462,7 @@
           </m:f>
           <m:r>
             <w:rPr>
-              <w:rFonts w:ascii="Cambria Math" w:eastAsiaTheme="minorEastAsia" w:hAnsi="Cambria Math"/>
+              <w:rFonts w:ascii="Cambria Math" w:hAnsi="Cambria Math" w:eastAsiaTheme="minorEastAsia"/>
               <w:sz w:val="28"/>
               <w:szCs w:val="28"/>
             </w:rPr>
@@ -3531,7 +3473,7 @@
               <m:sty m:val="bi"/>
             </m:rPr>
             <w:rPr>
-              <w:rFonts w:ascii="Cambria Math" w:eastAsiaTheme="minorEastAsia" w:hAnsi="Cambria Math"/>
+              <w:rFonts w:ascii="Cambria Math" w:hAnsi="Cambria Math" w:eastAsiaTheme="minorEastAsia"/>
               <w:sz w:val="28"/>
               <w:szCs w:val="28"/>
             </w:rPr>
@@ -3542,7 +3484,7 @@
               <m:nor/>
             </m:rPr>
             <w:rPr>
-              <w:rFonts w:ascii="Cambria Math" w:eastAsiaTheme="minorEastAsia" w:hAnsi="Cambria Math"/>
+              <w:rFonts w:ascii="Cambria Math" w:hAnsi="Cambria Math" w:eastAsiaTheme="minorEastAsia"/>
               <w:b/>
               <w:bCs/>
               <w:sz w:val="28"/>
@@ -3653,7 +3595,7 @@
         <m:oMath>
           <m:r>
             <w:rPr>
-              <w:rFonts w:ascii="Cambria Math" w:eastAsiaTheme="minorEastAsia" w:hAnsi="Cambria Math"/>
+              <w:rFonts w:ascii="Cambria Math" w:hAnsi="Cambria Math" w:eastAsiaTheme="minorEastAsia"/>
               <w:sz w:val="28"/>
               <w:szCs w:val="28"/>
             </w:rPr>
@@ -3675,7 +3617,7 @@
         <m:oMath>
           <m:r>
             <w:rPr>
-              <w:rFonts w:ascii="Cambria Math" w:eastAsiaTheme="minorEastAsia" w:hAnsi="Cambria Math"/>
+              <w:rFonts w:ascii="Cambria Math" w:hAnsi="Cambria Math" w:eastAsiaTheme="minorEastAsia"/>
               <w:sz w:val="28"/>
               <w:szCs w:val="28"/>
             </w:rPr>
@@ -3685,7 +3627,7 @@
             <m:fPr>
               <m:ctrlPr>
                 <w:rPr>
-                  <w:rFonts w:ascii="Cambria Math" w:eastAsiaTheme="minorEastAsia" w:hAnsi="Cambria Math"/>
+                  <w:rFonts w:ascii="Cambria Math" w:hAnsi="Cambria Math" w:eastAsiaTheme="minorEastAsia"/>
                   <w:i/>
                   <w:sz w:val="28"/>
                   <w:szCs w:val="28"/>
@@ -3695,7 +3637,7 @@
             <m:num>
               <m:r>
                 <w:rPr>
-                  <w:rFonts w:ascii="Cambria Math" w:eastAsiaTheme="minorEastAsia" w:hAnsi="Cambria Math"/>
+                  <w:rFonts w:ascii="Cambria Math" w:hAnsi="Cambria Math" w:eastAsiaTheme="minorEastAsia"/>
                   <w:sz w:val="28"/>
                   <w:szCs w:val="28"/>
                 </w:rPr>
@@ -3705,7 +3647,7 @@
             <m:den>
               <m:r>
                 <w:rPr>
-                  <w:rFonts w:ascii="Cambria Math" w:eastAsiaTheme="minorEastAsia" w:hAnsi="Cambria Math"/>
+                  <w:rFonts w:ascii="Cambria Math" w:hAnsi="Cambria Math" w:eastAsiaTheme="minorEastAsia"/>
                   <w:sz w:val="28"/>
                   <w:szCs w:val="28"/>
                 </w:rPr>
@@ -3715,7 +3657,7 @@
           </m:f>
           <m:r>
             <w:rPr>
-              <w:rFonts w:ascii="Cambria Math" w:eastAsiaTheme="minorEastAsia" w:hAnsi="Cambria Math"/>
+              <w:rFonts w:ascii="Cambria Math" w:hAnsi="Cambria Math" w:eastAsiaTheme="minorEastAsia"/>
               <w:sz w:val="28"/>
               <w:szCs w:val="28"/>
             </w:rPr>
@@ -3725,7 +3667,7 @@
             <m:fPr>
               <m:ctrlPr>
                 <w:rPr>
-                  <w:rFonts w:ascii="Cambria Math" w:eastAsiaTheme="minorEastAsia" w:hAnsi="Cambria Math"/>
+                  <w:rFonts w:ascii="Cambria Math" w:hAnsi="Cambria Math" w:eastAsiaTheme="minorEastAsia"/>
                   <w:i/>
                   <w:sz w:val="28"/>
                   <w:szCs w:val="28"/>
@@ -3735,7 +3677,7 @@
             <m:num>
               <m:r>
                 <w:rPr>
-                  <w:rFonts w:ascii="Cambria Math" w:eastAsiaTheme="minorEastAsia" w:hAnsi="Cambria Math"/>
+                  <w:rFonts w:ascii="Cambria Math" w:hAnsi="Cambria Math" w:eastAsiaTheme="minorEastAsia"/>
                   <w:sz w:val="28"/>
                   <w:szCs w:val="28"/>
                 </w:rPr>
@@ -3745,7 +3687,7 @@
             <m:den>
               <m:r>
                 <w:rPr>
-                  <w:rFonts w:ascii="Cambria Math" w:eastAsiaTheme="minorEastAsia" w:hAnsi="Cambria Math"/>
+                  <w:rFonts w:ascii="Cambria Math" w:hAnsi="Cambria Math" w:eastAsiaTheme="minorEastAsia"/>
                   <w:sz w:val="28"/>
                   <w:szCs w:val="28"/>
                 </w:rPr>
@@ -3755,7 +3697,7 @@
           </m:f>
           <m:r>
             <w:rPr>
-              <w:rFonts w:ascii="Cambria Math" w:eastAsiaTheme="minorEastAsia" w:hAnsi="Cambria Math"/>
+              <w:rFonts w:ascii="Cambria Math" w:hAnsi="Cambria Math" w:eastAsiaTheme="minorEastAsia"/>
               <w:sz w:val="28"/>
               <w:szCs w:val="28"/>
             </w:rPr>
@@ -3766,7 +3708,7 @@
               <m:sty m:val="bi"/>
             </m:rPr>
             <w:rPr>
-              <w:rFonts w:ascii="Cambria Math" w:eastAsiaTheme="minorEastAsia" w:hAnsi="Cambria Math"/>
+              <w:rFonts w:ascii="Cambria Math" w:hAnsi="Cambria Math" w:eastAsiaTheme="minorEastAsia"/>
               <w:sz w:val="28"/>
               <w:szCs w:val="28"/>
             </w:rPr>
@@ -3777,7 +3719,7 @@
               <m:nor/>
             </m:rPr>
             <w:rPr>
-              <w:rFonts w:ascii="Cambria Math" w:eastAsiaTheme="minorEastAsia" w:hAnsi="Cambria Math"/>
+              <w:rFonts w:ascii="Cambria Math" w:hAnsi="Cambria Math" w:eastAsiaTheme="minorEastAsia"/>
               <w:b/>
               <w:bCs/>
               <w:sz w:val="28"/>
@@ -3925,7 +3867,7 @@
         <m:oMath>
           <m:r>
             <w:rPr>
-              <w:rFonts w:ascii="Cambria Math" w:eastAsiaTheme="minorEastAsia" w:hAnsi="Cambria Math"/>
+              <w:rFonts w:ascii="Cambria Math" w:hAnsi="Cambria Math" w:eastAsiaTheme="minorEastAsia"/>
               <w:sz w:val="28"/>
               <w:szCs w:val="28"/>
             </w:rPr>
@@ -3935,7 +3877,7 @@
             <m:fPr>
               <m:ctrlPr>
                 <w:rPr>
-                  <w:rFonts w:ascii="Cambria Math" w:eastAsiaTheme="minorEastAsia" w:hAnsi="Cambria Math"/>
+                  <w:rFonts w:ascii="Cambria Math" w:hAnsi="Cambria Math" w:eastAsiaTheme="minorEastAsia"/>
                   <w:i/>
                   <w:sz w:val="28"/>
                   <w:szCs w:val="28"/>
@@ -3945,7 +3887,7 @@
             <m:num>
               <m:r>
                 <w:rPr>
-                  <w:rFonts w:ascii="Cambria Math" w:eastAsiaTheme="minorEastAsia" w:hAnsi="Cambria Math"/>
+                  <w:rFonts w:ascii="Cambria Math" w:hAnsi="Cambria Math" w:eastAsiaTheme="minorEastAsia"/>
                   <w:sz w:val="28"/>
                   <w:szCs w:val="28"/>
                 </w:rPr>
@@ -3955,7 +3897,7 @@
             <m:den>
               <m:r>
                 <w:rPr>
-                  <w:rFonts w:ascii="Cambria Math" w:eastAsiaTheme="minorEastAsia" w:hAnsi="Cambria Math"/>
+                  <w:rFonts w:ascii="Cambria Math" w:hAnsi="Cambria Math" w:eastAsiaTheme="minorEastAsia"/>
                   <w:sz w:val="28"/>
                   <w:szCs w:val="28"/>
                 </w:rPr>
@@ -3965,7 +3907,7 @@
           </m:f>
           <m:r>
             <w:rPr>
-              <w:rFonts w:ascii="Cambria Math" w:eastAsiaTheme="minorEastAsia" w:hAnsi="Cambria Math"/>
+              <w:rFonts w:ascii="Cambria Math" w:hAnsi="Cambria Math" w:eastAsiaTheme="minorEastAsia"/>
               <w:sz w:val="28"/>
               <w:szCs w:val="28"/>
             </w:rPr>
@@ -3975,7 +3917,7 @@
             <m:fPr>
               <m:ctrlPr>
                 <w:rPr>
-                  <w:rFonts w:ascii="Cambria Math" w:eastAsiaTheme="minorEastAsia" w:hAnsi="Cambria Math"/>
+                  <w:rFonts w:ascii="Cambria Math" w:hAnsi="Cambria Math" w:eastAsiaTheme="minorEastAsia"/>
                   <w:i/>
                   <w:sz w:val="28"/>
                   <w:szCs w:val="28"/>
@@ -3985,7 +3927,7 @@
             <m:num>
               <m:r>
                 <w:rPr>
-                  <w:rFonts w:ascii="Cambria Math" w:eastAsiaTheme="minorEastAsia" w:hAnsi="Cambria Math"/>
+                  <w:rFonts w:ascii="Cambria Math" w:hAnsi="Cambria Math" w:eastAsiaTheme="minorEastAsia"/>
                   <w:sz w:val="28"/>
                   <w:szCs w:val="28"/>
                 </w:rPr>
@@ -3995,7 +3937,7 @@
             <m:den>
               <m:r>
                 <w:rPr>
-                  <w:rFonts w:ascii="Cambria Math" w:eastAsiaTheme="minorEastAsia" w:hAnsi="Cambria Math"/>
+                  <w:rFonts w:ascii="Cambria Math" w:hAnsi="Cambria Math" w:eastAsiaTheme="minorEastAsia"/>
                   <w:sz w:val="28"/>
                   <w:szCs w:val="28"/>
                 </w:rPr>
@@ -4005,7 +3947,7 @@
           </m:f>
           <m:r>
             <w:rPr>
-              <w:rFonts w:ascii="Cambria Math" w:eastAsiaTheme="minorEastAsia" w:hAnsi="Cambria Math"/>
+              <w:rFonts w:ascii="Cambria Math" w:hAnsi="Cambria Math" w:eastAsiaTheme="minorEastAsia"/>
               <w:sz w:val="28"/>
               <w:szCs w:val="28"/>
             </w:rPr>
@@ -4027,7 +3969,7 @@
         <m:oMath>
           <m:r>
             <w:rPr>
-              <w:rFonts w:ascii="Cambria Math" w:eastAsiaTheme="minorEastAsia" w:hAnsi="Cambria Math"/>
+              <w:rFonts w:ascii="Cambria Math" w:hAnsi="Cambria Math" w:eastAsiaTheme="minorEastAsia"/>
               <w:sz w:val="28"/>
               <w:szCs w:val="28"/>
             </w:rPr>
@@ -4051,7 +3993,7 @@
         <m:oMath>
           <m:r>
             <w:rPr>
-              <w:rFonts w:ascii="Cambria Math" w:eastAsiaTheme="minorEastAsia" w:hAnsi="Cambria Math"/>
+              <w:rFonts w:ascii="Cambria Math" w:hAnsi="Cambria Math" w:eastAsiaTheme="minorEastAsia"/>
               <w:sz w:val="28"/>
               <w:szCs w:val="28"/>
             </w:rPr>
@@ -4062,7 +4004,7 @@
               <m:sty m:val="bi"/>
             </m:rPr>
             <w:rPr>
-              <w:rFonts w:ascii="Cambria Math" w:eastAsiaTheme="minorEastAsia" w:hAnsi="Cambria Math"/>
+              <w:rFonts w:ascii="Cambria Math" w:hAnsi="Cambria Math" w:eastAsiaTheme="minorEastAsia"/>
               <w:sz w:val="28"/>
               <w:szCs w:val="28"/>
             </w:rPr>
@@ -4073,7 +4015,7 @@
               <m:sty m:val="bi"/>
             </m:rPr>
             <w:rPr>
-              <w:rFonts w:ascii="Cambria Math" w:eastAsiaTheme="minorEastAsia" w:hAnsi="Cambria Math"/>
+              <w:rFonts w:ascii="Cambria Math" w:hAnsi="Cambria Math" w:eastAsiaTheme="minorEastAsia"/>
               <w:sz w:val="28"/>
               <w:szCs w:val="28"/>
             </w:rPr>
@@ -4211,7 +4153,7 @@
         <m:oMath>
           <m:r>
             <w:rPr>
-              <w:rFonts w:ascii="Cambria Math" w:eastAsiaTheme="minorEastAsia" w:hAnsi="Cambria Math"/>
+              <w:rFonts w:ascii="Cambria Math" w:hAnsi="Cambria Math" w:eastAsiaTheme="minorEastAsia"/>
               <w:sz w:val="28"/>
               <w:szCs w:val="28"/>
             </w:rPr>
@@ -4221,7 +4163,7 @@
             <m:fPr>
               <m:ctrlPr>
                 <w:rPr>
-                  <w:rFonts w:ascii="Cambria Math" w:eastAsiaTheme="minorEastAsia" w:hAnsi="Cambria Math"/>
+                  <w:rFonts w:ascii="Cambria Math" w:hAnsi="Cambria Math" w:eastAsiaTheme="minorEastAsia"/>
                   <w:i/>
                   <w:sz w:val="28"/>
                   <w:szCs w:val="28"/>
@@ -4231,7 +4173,7 @@
             <m:num>
               <m:r>
                 <w:rPr>
-                  <w:rFonts w:ascii="Cambria Math" w:eastAsiaTheme="minorEastAsia" w:hAnsi="Cambria Math"/>
+                  <w:rFonts w:ascii="Cambria Math" w:hAnsi="Cambria Math" w:eastAsiaTheme="minorEastAsia"/>
                   <w:sz w:val="28"/>
                   <w:szCs w:val="28"/>
                 </w:rPr>
@@ -4241,7 +4183,7 @@
             <m:den>
               <m:r>
                 <w:rPr>
-                  <w:rFonts w:ascii="Cambria Math" w:eastAsiaTheme="minorEastAsia" w:hAnsi="Cambria Math"/>
+                  <w:rFonts w:ascii="Cambria Math" w:hAnsi="Cambria Math" w:eastAsiaTheme="minorEastAsia"/>
                   <w:sz w:val="28"/>
                   <w:szCs w:val="28"/>
                 </w:rPr>
@@ -4251,7 +4193,7 @@
           </m:f>
           <m:r>
             <w:rPr>
-              <w:rFonts w:ascii="Cambria Math" w:eastAsiaTheme="minorEastAsia" w:hAnsi="Cambria Math"/>
+              <w:rFonts w:ascii="Cambria Math" w:hAnsi="Cambria Math" w:eastAsiaTheme="minorEastAsia"/>
               <w:sz w:val="28"/>
               <w:szCs w:val="28"/>
             </w:rPr>
@@ -4261,7 +4203,7 @@
             <m:fPr>
               <m:ctrlPr>
                 <w:rPr>
-                  <w:rFonts w:ascii="Cambria Math" w:eastAsiaTheme="minorEastAsia" w:hAnsi="Cambria Math"/>
+                  <w:rFonts w:ascii="Cambria Math" w:hAnsi="Cambria Math" w:eastAsiaTheme="minorEastAsia"/>
                   <w:i/>
                   <w:sz w:val="28"/>
                   <w:szCs w:val="28"/>
@@ -4271,7 +4213,7 @@
             <m:num>
               <m:r>
                 <w:rPr>
-                  <w:rFonts w:ascii="Cambria Math" w:eastAsiaTheme="minorEastAsia" w:hAnsi="Cambria Math"/>
+                  <w:rFonts w:ascii="Cambria Math" w:hAnsi="Cambria Math" w:eastAsiaTheme="minorEastAsia"/>
                   <w:sz w:val="28"/>
                   <w:szCs w:val="28"/>
                 </w:rPr>
@@ -4281,7 +4223,7 @@
             <m:den>
               <m:r>
                 <w:rPr>
-                  <w:rFonts w:ascii="Cambria Math" w:eastAsiaTheme="minorEastAsia" w:hAnsi="Cambria Math"/>
+                  <w:rFonts w:ascii="Cambria Math" w:hAnsi="Cambria Math" w:eastAsiaTheme="minorEastAsia"/>
                   <w:sz w:val="28"/>
                   <w:szCs w:val="28"/>
                 </w:rPr>
@@ -4291,7 +4233,7 @@
           </m:f>
           <m:r>
             <w:rPr>
-              <w:rFonts w:ascii="Cambria Math" w:eastAsiaTheme="minorEastAsia" w:hAnsi="Cambria Math"/>
+              <w:rFonts w:ascii="Cambria Math" w:hAnsi="Cambria Math" w:eastAsiaTheme="minorEastAsia"/>
               <w:sz w:val="28"/>
               <w:szCs w:val="28"/>
             </w:rPr>
@@ -4313,7 +4255,7 @@
         <m:oMath>
           <m:r>
             <w:rPr>
-              <w:rFonts w:ascii="Cambria Math" w:eastAsiaTheme="minorEastAsia" w:hAnsi="Cambria Math"/>
+              <w:rFonts w:ascii="Cambria Math" w:hAnsi="Cambria Math" w:eastAsiaTheme="minorEastAsia"/>
               <w:sz w:val="28"/>
               <w:szCs w:val="28"/>
             </w:rPr>
@@ -4337,7 +4279,7 @@
         <m:oMath>
           <m:r>
             <w:rPr>
-              <w:rFonts w:ascii="Cambria Math" w:eastAsiaTheme="minorEastAsia" w:hAnsi="Cambria Math"/>
+              <w:rFonts w:ascii="Cambria Math" w:hAnsi="Cambria Math" w:eastAsiaTheme="minorEastAsia"/>
               <w:sz w:val="28"/>
               <w:szCs w:val="28"/>
             </w:rPr>
@@ -4348,7 +4290,7 @@
               <m:sty m:val="bi"/>
             </m:rPr>
             <w:rPr>
-              <w:rFonts w:ascii="Cambria Math" w:eastAsiaTheme="minorEastAsia" w:hAnsi="Cambria Math"/>
+              <w:rFonts w:ascii="Cambria Math" w:hAnsi="Cambria Math" w:eastAsiaTheme="minorEastAsia"/>
               <w:sz w:val="28"/>
               <w:szCs w:val="28"/>
             </w:rPr>
@@ -4359,7 +4301,7 @@
               <m:sty m:val="bi"/>
             </m:rPr>
             <w:rPr>
-              <w:rFonts w:ascii="Cambria Math" w:eastAsiaTheme="minorEastAsia" w:hAnsi="Cambria Math"/>
+              <w:rFonts w:ascii="Cambria Math" w:hAnsi="Cambria Math" w:eastAsiaTheme="minorEastAsia"/>
               <w:sz w:val="28"/>
               <w:szCs w:val="28"/>
             </w:rPr>
@@ -4475,7 +4417,7 @@
         <m:oMath>
           <m:r>
             <w:rPr>
-              <w:rFonts w:ascii="Cambria Math" w:eastAsiaTheme="minorEastAsia" w:hAnsi="Cambria Math"/>
+              <w:rFonts w:ascii="Cambria Math" w:hAnsi="Cambria Math" w:eastAsiaTheme="minorEastAsia"/>
               <w:sz w:val="28"/>
               <w:szCs w:val="28"/>
             </w:rPr>
@@ -4485,7 +4427,7 @@
             <m:fPr>
               <m:ctrlPr>
                 <w:rPr>
-                  <w:rFonts w:ascii="Cambria Math" w:eastAsiaTheme="minorEastAsia" w:hAnsi="Cambria Math"/>
+                  <w:rFonts w:ascii="Cambria Math" w:hAnsi="Cambria Math" w:eastAsiaTheme="minorEastAsia"/>
                   <w:i/>
                   <w:sz w:val="28"/>
                   <w:szCs w:val="28"/>
@@ -4495,7 +4437,7 @@
             <m:num>
               <m:r>
                 <w:rPr>
-                  <w:rFonts w:ascii="Cambria Math" w:eastAsiaTheme="minorEastAsia" w:hAnsi="Cambria Math"/>
+                  <w:rFonts w:ascii="Cambria Math" w:hAnsi="Cambria Math" w:eastAsiaTheme="minorEastAsia"/>
                   <w:sz w:val="28"/>
                   <w:szCs w:val="28"/>
                 </w:rPr>
@@ -4505,7 +4447,7 @@
             <m:den>
               <m:r>
                 <w:rPr>
-                  <w:rFonts w:ascii="Cambria Math" w:eastAsiaTheme="minorEastAsia" w:hAnsi="Cambria Math"/>
+                  <w:rFonts w:ascii="Cambria Math" w:hAnsi="Cambria Math" w:eastAsiaTheme="minorEastAsia"/>
                   <w:sz w:val="28"/>
                   <w:szCs w:val="28"/>
                 </w:rPr>
@@ -4515,7 +4457,7 @@
           </m:f>
           <m:r>
             <w:rPr>
-              <w:rFonts w:ascii="Cambria Math" w:eastAsiaTheme="minorEastAsia" w:hAnsi="Cambria Math"/>
+              <w:rFonts w:ascii="Cambria Math" w:hAnsi="Cambria Math" w:eastAsiaTheme="minorEastAsia"/>
               <w:sz w:val="28"/>
               <w:szCs w:val="28"/>
             </w:rPr>
@@ -4525,7 +4467,7 @@
             <m:fPr>
               <m:ctrlPr>
                 <w:rPr>
-                  <w:rFonts w:ascii="Cambria Math" w:eastAsiaTheme="minorEastAsia" w:hAnsi="Cambria Math"/>
+                  <w:rFonts w:ascii="Cambria Math" w:hAnsi="Cambria Math" w:eastAsiaTheme="minorEastAsia"/>
                   <w:i/>
                   <w:sz w:val="28"/>
                   <w:szCs w:val="28"/>
@@ -4535,7 +4477,7 @@
             <m:num>
               <m:r>
                 <w:rPr>
-                  <w:rFonts w:ascii="Cambria Math" w:eastAsiaTheme="minorEastAsia" w:hAnsi="Cambria Math"/>
+                  <w:rFonts w:ascii="Cambria Math" w:hAnsi="Cambria Math" w:eastAsiaTheme="minorEastAsia"/>
                   <w:sz w:val="28"/>
                   <w:szCs w:val="28"/>
                 </w:rPr>
@@ -4545,7 +4487,7 @@
             <m:den>
               <m:r>
                 <w:rPr>
-                  <w:rFonts w:ascii="Cambria Math" w:eastAsiaTheme="minorEastAsia" w:hAnsi="Cambria Math"/>
+                  <w:rFonts w:ascii="Cambria Math" w:hAnsi="Cambria Math" w:eastAsiaTheme="minorEastAsia"/>
                   <w:sz w:val="28"/>
                   <w:szCs w:val="28"/>
                 </w:rPr>
@@ -4555,7 +4497,7 @@
           </m:f>
           <m:r>
             <w:rPr>
-              <w:rFonts w:ascii="Cambria Math" w:eastAsiaTheme="minorEastAsia" w:hAnsi="Cambria Math"/>
+              <w:rFonts w:ascii="Cambria Math" w:hAnsi="Cambria Math" w:eastAsiaTheme="minorEastAsia"/>
               <w:sz w:val="28"/>
               <w:szCs w:val="28"/>
             </w:rPr>
@@ -4627,7 +4569,7 @@
         <m:oMath>
           <m:r>
             <w:rPr>
-              <w:rFonts w:ascii="Cambria Math" w:eastAsiaTheme="minorEastAsia" w:hAnsi="Cambria Math"/>
+              <w:rFonts w:ascii="Cambria Math" w:hAnsi="Cambria Math" w:eastAsiaTheme="minorEastAsia"/>
               <w:sz w:val="28"/>
               <w:szCs w:val="28"/>
             </w:rPr>
@@ -4651,7 +4593,7 @@
         <m:oMath>
           <m:r>
             <w:rPr>
-              <w:rFonts w:ascii="Cambria Math" w:eastAsiaTheme="minorEastAsia" w:hAnsi="Cambria Math"/>
+              <w:rFonts w:ascii="Cambria Math" w:hAnsi="Cambria Math" w:eastAsiaTheme="minorEastAsia"/>
               <w:sz w:val="28"/>
               <w:szCs w:val="28"/>
             </w:rPr>
@@ -4662,7 +4604,7 @@
               <m:sty m:val="bi"/>
             </m:rPr>
             <w:rPr>
-              <w:rFonts w:ascii="Cambria Math" w:eastAsiaTheme="minorEastAsia" w:hAnsi="Cambria Math"/>
+              <w:rFonts w:ascii="Cambria Math" w:hAnsi="Cambria Math" w:eastAsiaTheme="minorEastAsia"/>
               <w:sz w:val="28"/>
               <w:szCs w:val="28"/>
             </w:rPr>
@@ -4673,7 +4615,7 @@
               <m:sty m:val="bi"/>
             </m:rPr>
             <w:rPr>
-              <w:rFonts w:ascii="Cambria Math" w:eastAsiaTheme="minorEastAsia" w:hAnsi="Cambria Math"/>
+              <w:rFonts w:ascii="Cambria Math" w:hAnsi="Cambria Math" w:eastAsiaTheme="minorEastAsia"/>
               <w:sz w:val="28"/>
               <w:szCs w:val="28"/>
             </w:rPr>
@@ -4732,7 +4674,7 @@
         <m:oMath>
           <m:r>
             <w:rPr>
-              <w:rFonts w:ascii="Cambria Math" w:eastAsiaTheme="minorEastAsia" w:hAnsi="Cambria Math"/>
+              <w:rFonts w:ascii="Cambria Math" w:hAnsi="Cambria Math" w:eastAsiaTheme="minorEastAsia"/>
               <w:sz w:val="28"/>
               <w:szCs w:val="28"/>
             </w:rPr>
@@ -4756,7 +4698,7 @@
         <m:oMath>
           <m:r>
             <w:rPr>
-              <w:rFonts w:ascii="Cambria Math" w:eastAsiaTheme="minorEastAsia" w:hAnsi="Cambria Math"/>
+              <w:rFonts w:ascii="Cambria Math" w:hAnsi="Cambria Math" w:eastAsiaTheme="minorEastAsia"/>
               <w:sz w:val="28"/>
               <w:szCs w:val="28"/>
             </w:rPr>
@@ -4767,7 +4709,7 @@
               <m:sty m:val="bi"/>
             </m:rPr>
             <w:rPr>
-              <w:rFonts w:ascii="Cambria Math" w:eastAsiaTheme="minorEastAsia" w:hAnsi="Cambria Math"/>
+              <w:rFonts w:ascii="Cambria Math" w:hAnsi="Cambria Math" w:eastAsiaTheme="minorEastAsia"/>
               <w:sz w:val="28"/>
               <w:szCs w:val="28"/>
             </w:rPr>
@@ -4778,7 +4720,7 @@
               <m:sty m:val="bi"/>
             </m:rPr>
             <w:rPr>
-              <w:rFonts w:ascii="Cambria Math" w:eastAsiaTheme="minorEastAsia" w:hAnsi="Cambria Math"/>
+              <w:rFonts w:ascii="Cambria Math" w:hAnsi="Cambria Math" w:eastAsiaTheme="minorEastAsia"/>
               <w:sz w:val="28"/>
               <w:szCs w:val="28"/>
             </w:rPr>
@@ -4830,7 +4772,7 @@
         <m:oMath>
           <m:r>
             <w:rPr>
-              <w:rFonts w:ascii="Cambria Math" w:eastAsiaTheme="minorEastAsia" w:hAnsi="Cambria Math"/>
+              <w:rFonts w:ascii="Cambria Math" w:hAnsi="Cambria Math" w:eastAsiaTheme="minorEastAsia"/>
               <w:sz w:val="28"/>
               <w:szCs w:val="28"/>
             </w:rPr>
@@ -4854,7 +4796,7 @@
         <m:oMath>
           <m:r>
             <w:rPr>
-              <w:rFonts w:ascii="Cambria Math" w:eastAsiaTheme="minorEastAsia" w:hAnsi="Cambria Math"/>
+              <w:rFonts w:ascii="Cambria Math" w:hAnsi="Cambria Math" w:eastAsiaTheme="minorEastAsia"/>
               <w:sz w:val="28"/>
               <w:szCs w:val="28"/>
             </w:rPr>
@@ -4865,7 +4807,7 @@
               <m:sty m:val="bi"/>
             </m:rPr>
             <w:rPr>
-              <w:rFonts w:ascii="Cambria Math" w:eastAsiaTheme="minorEastAsia" w:hAnsi="Cambria Math"/>
+              <w:rFonts w:ascii="Cambria Math" w:hAnsi="Cambria Math" w:eastAsiaTheme="minorEastAsia"/>
               <w:sz w:val="28"/>
               <w:szCs w:val="28"/>
             </w:rPr>
@@ -4876,7 +4818,7 @@
               <m:sty m:val="bi"/>
             </m:rPr>
             <w:rPr>
-              <w:rFonts w:ascii="Cambria Math" w:eastAsiaTheme="minorEastAsia" w:hAnsi="Cambria Math"/>
+              <w:rFonts w:ascii="Cambria Math" w:hAnsi="Cambria Math" w:eastAsiaTheme="minorEastAsia"/>
               <w:sz w:val="28"/>
               <w:szCs w:val="28"/>
             </w:rPr>
@@ -4946,7 +4888,7 @@
           </m:r>
           <m:r>
             <w:rPr>
-              <w:rFonts w:ascii="Cambria Math" w:eastAsiaTheme="minorEastAsia" w:hAnsi="Cambria Math"/>
+              <w:rFonts w:ascii="Cambria Math" w:hAnsi="Cambria Math" w:eastAsiaTheme="minorEastAsia"/>
               <w:sz w:val="28"/>
               <w:szCs w:val="28"/>
             </w:rPr>
@@ -4957,7 +4899,7 @@
               <m:sty m:val="bi"/>
             </m:rPr>
             <w:rPr>
-              <w:rFonts w:ascii="Cambria Math" w:eastAsiaTheme="minorEastAsia" w:hAnsi="Cambria Math"/>
+              <w:rFonts w:ascii="Cambria Math" w:hAnsi="Cambria Math" w:eastAsiaTheme="minorEastAsia"/>
               <w:sz w:val="28"/>
               <w:szCs w:val="28"/>
             </w:rPr>
@@ -4968,7 +4910,7 @@
               <m:sty m:val="bi"/>
             </m:rPr>
             <w:rPr>
-              <w:rFonts w:ascii="Cambria Math" w:eastAsiaTheme="minorEastAsia" w:hAnsi="Cambria Math"/>
+              <w:rFonts w:ascii="Cambria Math" w:hAnsi="Cambria Math" w:eastAsiaTheme="minorEastAsia"/>
               <w:sz w:val="28"/>
               <w:szCs w:val="28"/>
             </w:rPr>
@@ -5064,7 +5006,7 @@
     </w:p>
     <w:sectPr>
       <w:footerReference w:type="default" r:id="rId11"/>
-      <w:pgSz w:w="11906" w:h="16838"/>
+      <w:pgSz w:w="11906" w:h="16838" w:orient="portrait"/>
       <w:pgMar w:top="567" w:right="851" w:bottom="567" w:left="851" w:header="709" w:footer="709" w:gutter="0"/>
       <w:cols w:space="708"/>
       <w:docGrid w:linePitch="360"/>
@@ -5240,7 +5182,7 @@
         <w:ind w:left="720" w:hanging="360"/>
       </w:pPr>
       <w:rPr>
-        <w:rFonts w:asciiTheme="minorHAnsi" w:hAnsiTheme="minorHAnsi" w:cstheme="minorHAnsi" w:hint="default"/>
+        <w:rFonts w:hint="default" w:asciiTheme="minorHAnsi" w:hAnsiTheme="minorHAnsi" w:cstheme="minorHAnsi"/>
       </w:rPr>
     </w:lvl>
     <w:lvl w:ilvl="1" w:tplc="08090019" w:tentative="1">
@@ -5698,7 +5640,7 @@
   <w:docDefaults>
     <w:rPrDefault>
       <w:rPr>
-        <w:rFonts w:asciiTheme="minorHAnsi" w:eastAsiaTheme="minorHAnsi" w:hAnsiTheme="minorHAnsi" w:cstheme="minorBidi"/>
+        <w:rFonts w:asciiTheme="minorHAnsi" w:hAnsiTheme="minorHAnsi" w:eastAsiaTheme="minorHAnsi" w:cstheme="minorBidi"/>
         <w:sz w:val="22"/>
         <w:szCs w:val="22"/>
         <w:lang w:val="en-GB" w:eastAsia="en-US" w:bidi="ar-SA"/>
@@ -5713,14 +5655,14 @@
   <w:latentStyles w:defLockedState="0" w:defUIPriority="99" w:defSemiHidden="0" w:defUnhideWhenUsed="0" w:defQFormat="0" w:count="376">
     <w:lsdException w:name="Normal" w:uiPriority="0" w:qFormat="1"/>
     <w:lsdException w:name="heading 1" w:uiPriority="9" w:qFormat="1"/>
-    <w:lsdException w:name="heading 2" w:semiHidden="1" w:uiPriority="9" w:unhideWhenUsed="1" w:qFormat="1"/>
-    <w:lsdException w:name="heading 3" w:semiHidden="1" w:uiPriority="9" w:unhideWhenUsed="1" w:qFormat="1"/>
-    <w:lsdException w:name="heading 4" w:semiHidden="1" w:uiPriority="9" w:unhideWhenUsed="1" w:qFormat="1"/>
-    <w:lsdException w:name="heading 5" w:semiHidden="1" w:uiPriority="9" w:unhideWhenUsed="1" w:qFormat="1"/>
-    <w:lsdException w:name="heading 6" w:semiHidden="1" w:uiPriority="9" w:unhideWhenUsed="1" w:qFormat="1"/>
-    <w:lsdException w:name="heading 7" w:semiHidden="1" w:uiPriority="9" w:unhideWhenUsed="1" w:qFormat="1"/>
-    <w:lsdException w:name="heading 8" w:semiHidden="1" w:uiPriority="9" w:unhideWhenUsed="1" w:qFormat="1"/>
-    <w:lsdException w:name="heading 9" w:semiHidden="1" w:uiPriority="9" w:unhideWhenUsed="1" w:qFormat="1"/>
+    <w:lsdException w:name="heading 2" w:uiPriority="9" w:semiHidden="1" w:unhideWhenUsed="1" w:qFormat="1"/>
+    <w:lsdException w:name="heading 3" w:uiPriority="9" w:semiHidden="1" w:unhideWhenUsed="1" w:qFormat="1"/>
+    <w:lsdException w:name="heading 4" w:uiPriority="9" w:semiHidden="1" w:unhideWhenUsed="1" w:qFormat="1"/>
+    <w:lsdException w:name="heading 5" w:uiPriority="9" w:semiHidden="1" w:unhideWhenUsed="1" w:qFormat="1"/>
+    <w:lsdException w:name="heading 6" w:uiPriority="9" w:semiHidden="1" w:unhideWhenUsed="1" w:qFormat="1"/>
+    <w:lsdException w:name="heading 7" w:uiPriority="9" w:semiHidden="1" w:unhideWhenUsed="1" w:qFormat="1"/>
+    <w:lsdException w:name="heading 8" w:uiPriority="9" w:semiHidden="1" w:unhideWhenUsed="1" w:qFormat="1"/>
+    <w:lsdException w:name="heading 9" w:uiPriority="9" w:semiHidden="1" w:unhideWhenUsed="1" w:qFormat="1"/>
     <w:lsdException w:name="index 1" w:semiHidden="1" w:unhideWhenUsed="1"/>
     <w:lsdException w:name="index 2" w:semiHidden="1" w:unhideWhenUsed="1"/>
     <w:lsdException w:name="index 3" w:semiHidden="1" w:unhideWhenUsed="1"/>
@@ -5730,22 +5672,22 @@
     <w:lsdException w:name="index 7" w:semiHidden="1" w:unhideWhenUsed="1"/>
     <w:lsdException w:name="index 8" w:semiHidden="1" w:unhideWhenUsed="1"/>
     <w:lsdException w:name="index 9" w:semiHidden="1" w:unhideWhenUsed="1"/>
-    <w:lsdException w:name="toc 1" w:semiHidden="1" w:uiPriority="39" w:unhideWhenUsed="1"/>
-    <w:lsdException w:name="toc 2" w:semiHidden="1" w:uiPriority="39" w:unhideWhenUsed="1"/>
-    <w:lsdException w:name="toc 3" w:semiHidden="1" w:uiPriority="39" w:unhideWhenUsed="1"/>
-    <w:lsdException w:name="toc 4" w:semiHidden="1" w:uiPriority="39" w:unhideWhenUsed="1"/>
-    <w:lsdException w:name="toc 5" w:semiHidden="1" w:uiPriority="39" w:unhideWhenUsed="1"/>
-    <w:lsdException w:name="toc 6" w:semiHidden="1" w:uiPriority="39" w:unhideWhenUsed="1"/>
-    <w:lsdException w:name="toc 7" w:semiHidden="1" w:uiPriority="39" w:unhideWhenUsed="1"/>
-    <w:lsdException w:name="toc 8" w:semiHidden="1" w:uiPriority="39" w:unhideWhenUsed="1"/>
-    <w:lsdException w:name="toc 9" w:semiHidden="1" w:uiPriority="39" w:unhideWhenUsed="1"/>
+    <w:lsdException w:name="toc 1" w:uiPriority="39" w:semiHidden="1" w:unhideWhenUsed="1"/>
+    <w:lsdException w:name="toc 2" w:uiPriority="39" w:semiHidden="1" w:unhideWhenUsed="1"/>
+    <w:lsdException w:name="toc 3" w:uiPriority="39" w:semiHidden="1" w:unhideWhenUsed="1"/>
+    <w:lsdException w:name="toc 4" w:uiPriority="39" w:semiHidden="1" w:unhideWhenUsed="1"/>
+    <w:lsdException w:name="toc 5" w:uiPriority="39" w:semiHidden="1" w:unhideWhenUsed="1"/>
+    <w:lsdException w:name="toc 6" w:uiPriority="39" w:semiHidden="1" w:unhideWhenUsed="1"/>
+    <w:lsdException w:name="toc 7" w:uiPriority="39" w:semiHidden="1" w:unhideWhenUsed="1"/>
+    <w:lsdException w:name="toc 8" w:uiPriority="39" w:semiHidden="1" w:unhideWhenUsed="1"/>
+    <w:lsdException w:name="toc 9" w:uiPriority="39" w:semiHidden="1" w:unhideWhenUsed="1"/>
     <w:lsdException w:name="Normal Indent" w:semiHidden="1" w:unhideWhenUsed="1"/>
     <w:lsdException w:name="footnote text" w:semiHidden="1" w:unhideWhenUsed="1"/>
     <w:lsdException w:name="annotation text" w:semiHidden="1" w:unhideWhenUsed="1"/>
     <w:lsdException w:name="header" w:semiHidden="1" w:unhideWhenUsed="1"/>
     <w:lsdException w:name="footer" w:semiHidden="1" w:unhideWhenUsed="1"/>
     <w:lsdException w:name="index heading" w:semiHidden="1" w:unhideWhenUsed="1"/>
-    <w:lsdException w:name="caption" w:semiHidden="1" w:uiPriority="35" w:unhideWhenUsed="1" w:qFormat="1"/>
+    <w:lsdException w:name="caption" w:uiPriority="35" w:semiHidden="1" w:unhideWhenUsed="1" w:qFormat="1"/>
     <w:lsdException w:name="table of figures" w:semiHidden="1" w:unhideWhenUsed="1"/>
     <w:lsdException w:name="envelope address" w:semiHidden="1" w:unhideWhenUsed="1"/>
     <w:lsdException w:name="envelope return" w:semiHidden="1" w:unhideWhenUsed="1"/>
@@ -5776,7 +5718,7 @@
     <w:lsdException w:name="Title" w:uiPriority="10" w:qFormat="1"/>
     <w:lsdException w:name="Closing" w:semiHidden="1" w:unhideWhenUsed="1"/>
     <w:lsdException w:name="Signature" w:semiHidden="1" w:unhideWhenUsed="1"/>
-    <w:lsdException w:name="Default Paragraph Font" w:semiHidden="1" w:uiPriority="1" w:unhideWhenUsed="1"/>
+    <w:lsdException w:name="Default Paragraph Font" w:uiPriority="1" w:semiHidden="1" w:unhideWhenUsed="1"/>
     <w:lsdException w:name="Body Text" w:semiHidden="1" w:unhideWhenUsed="1"/>
     <w:lsdException w:name="Body Text Indent" w:semiHidden="1" w:unhideWhenUsed="1"/>
     <w:lsdException w:name="List Continue" w:semiHidden="1" w:unhideWhenUsed="1"/>
@@ -5976,8 +5918,8 @@
     <w:lsdException w:name="Subtle Reference" w:uiPriority="31" w:qFormat="1"/>
     <w:lsdException w:name="Intense Reference" w:uiPriority="32" w:qFormat="1"/>
     <w:lsdException w:name="Book Title" w:uiPriority="33" w:qFormat="1"/>
-    <w:lsdException w:name="Bibliography" w:semiHidden="1" w:uiPriority="37" w:unhideWhenUsed="1"/>
-    <w:lsdException w:name="TOC Heading" w:semiHidden="1" w:uiPriority="39" w:unhideWhenUsed="1" w:qFormat="1"/>
+    <w:lsdException w:name="Bibliography" w:uiPriority="37" w:semiHidden="1" w:unhideWhenUsed="1"/>
+    <w:lsdException w:name="TOC Heading" w:uiPriority="39" w:semiHidden="1" w:unhideWhenUsed="1" w:qFormat="1"/>
     <w:lsdException w:name="Plain Table 1" w:uiPriority="41"/>
     <w:lsdException w:name="Plain Table 2" w:uiPriority="42"/>
     <w:lsdException w:name="Plain Table 3" w:uiPriority="43"/>
@@ -6088,7 +6030,7 @@
     <w:lsdException w:name="Unresolved Mention" w:semiHidden="1" w:unhideWhenUsed="1"/>
     <w:lsdException w:name="Smart Link" w:semiHidden="1" w:unhideWhenUsed="1"/>
   </w:latentStyles>
-  <w:style w:type="paragraph" w:default="1" w:styleId="Normal">
+  <w:style w:type="paragraph" w:styleId="Normal" w:default="1">
     <w:name w:val="Normal"/>
     <w:qFormat/>
   </w:style>
@@ -6107,7 +6049,7 @@
       <w:outlineLvl w:val="0"/>
     </w:pPr>
     <w:rPr>
-      <w:rFonts w:asciiTheme="majorHAnsi" w:eastAsiaTheme="majorEastAsia" w:hAnsiTheme="majorHAnsi" w:cstheme="majorBidi"/>
+      <w:rFonts w:asciiTheme="majorHAnsi" w:hAnsiTheme="majorHAnsi" w:eastAsiaTheme="majorEastAsia" w:cstheme="majorBidi"/>
       <w:color w:val="2F5496" w:themeColor="accent1" w:themeShade="BF"/>
       <w:sz w:val="32"/>
       <w:szCs w:val="32"/>
@@ -6129,19 +6071,19 @@
       <w:outlineLvl w:val="1"/>
     </w:pPr>
     <w:rPr>
-      <w:rFonts w:asciiTheme="majorHAnsi" w:eastAsiaTheme="majorEastAsia" w:hAnsiTheme="majorHAnsi" w:cstheme="majorBidi"/>
+      <w:rFonts w:asciiTheme="majorHAnsi" w:hAnsiTheme="majorHAnsi" w:eastAsiaTheme="majorEastAsia" w:cstheme="majorBidi"/>
       <w:color w:val="2F5496" w:themeColor="accent1" w:themeShade="BF"/>
       <w:sz w:val="26"/>
       <w:szCs w:val="26"/>
     </w:rPr>
   </w:style>
-  <w:style w:type="character" w:default="1" w:styleId="DefaultParagraphFont">
+  <w:style w:type="character" w:styleId="DefaultParagraphFont" w:default="1">
     <w:name w:val="Default Paragraph Font"/>
     <w:uiPriority w:val="1"/>
     <w:semiHidden/>
     <w:unhideWhenUsed/>
   </w:style>
-  <w:style w:type="table" w:default="1" w:styleId="TableNormal">
+  <w:style w:type="table" w:styleId="TableNormal" w:default="1">
     <w:name w:val="Normal Table"/>
     <w:uiPriority w:val="99"/>
     <w:semiHidden/>
@@ -6156,7 +6098,7 @@
       </w:tblCellMar>
     </w:tblPr>
   </w:style>
-  <w:style w:type="numbering" w:default="1" w:styleId="NoList">
+  <w:style w:type="numbering" w:styleId="NoList" w:default="1">
     <w:name w:val="No List"/>
     <w:uiPriority w:val="99"/>
     <w:semiHidden/>
@@ -6177,7 +6119,7 @@
       <w:spacing w:after="0" w:line="240" w:lineRule="auto"/>
     </w:pPr>
   </w:style>
-  <w:style w:type="character" w:customStyle="1" w:styleId="HeaderChar">
+  <w:style w:type="character" w:styleId="HeaderChar" w:customStyle="1">
     <w:name w:val="Header Char"/>
     <w:basedOn w:val="DefaultParagraphFont"/>
     <w:link w:val="Header"/>
@@ -6199,21 +6141,21 @@
       <w:spacing w:after="0" w:line="240" w:lineRule="auto"/>
     </w:pPr>
   </w:style>
-  <w:style w:type="character" w:customStyle="1" w:styleId="FooterChar">
+  <w:style w:type="character" w:styleId="FooterChar" w:customStyle="1">
     <w:name w:val="Footer Char"/>
     <w:basedOn w:val="DefaultParagraphFont"/>
     <w:link w:val="Footer"/>
     <w:uiPriority w:val="99"/>
     <w:rsid w:val="00E7284E"/>
   </w:style>
-  <w:style w:type="character" w:customStyle="1" w:styleId="Heading1Char">
+  <w:style w:type="character" w:styleId="Heading1Char" w:customStyle="1">
     <w:name w:val="Heading 1 Char"/>
     <w:basedOn w:val="DefaultParagraphFont"/>
     <w:link w:val="Heading1"/>
     <w:uiPriority w:val="9"/>
     <w:rsid w:val="00E7284E"/>
     <w:rPr>
-      <w:rFonts w:asciiTheme="majorHAnsi" w:eastAsiaTheme="majorEastAsia" w:hAnsiTheme="majorHAnsi" w:cstheme="majorBidi"/>
+      <w:rFonts w:asciiTheme="majorHAnsi" w:hAnsiTheme="majorHAnsi" w:eastAsiaTheme="majorEastAsia" w:cstheme="majorBidi"/>
       <w:color w:val="2F5496" w:themeColor="accent1" w:themeShade="BF"/>
       <w:sz w:val="32"/>
       <w:szCs w:val="32"/>
@@ -6232,35 +6174,35 @@
       <w:contextualSpacing/>
     </w:pPr>
     <w:rPr>
-      <w:rFonts w:asciiTheme="majorHAnsi" w:eastAsiaTheme="majorEastAsia" w:hAnsiTheme="majorHAnsi" w:cstheme="majorBidi"/>
+      <w:rFonts w:asciiTheme="majorHAnsi" w:hAnsiTheme="majorHAnsi" w:eastAsiaTheme="majorEastAsia" w:cstheme="majorBidi"/>
       <w:spacing w:val="-10"/>
       <w:kern w:val="28"/>
       <w:sz w:val="56"/>
       <w:szCs w:val="56"/>
     </w:rPr>
   </w:style>
-  <w:style w:type="character" w:customStyle="1" w:styleId="TitleChar">
+  <w:style w:type="character" w:styleId="TitleChar" w:customStyle="1">
     <w:name w:val="Title Char"/>
     <w:basedOn w:val="DefaultParagraphFont"/>
     <w:link w:val="Title"/>
     <w:uiPriority w:val="10"/>
     <w:rsid w:val="00FF76FE"/>
     <w:rPr>
-      <w:rFonts w:asciiTheme="majorHAnsi" w:eastAsiaTheme="majorEastAsia" w:hAnsiTheme="majorHAnsi" w:cstheme="majorBidi"/>
+      <w:rFonts w:asciiTheme="majorHAnsi" w:hAnsiTheme="majorHAnsi" w:eastAsiaTheme="majorEastAsia" w:cstheme="majorBidi"/>
       <w:spacing w:val="-10"/>
       <w:kern w:val="28"/>
       <w:sz w:val="56"/>
       <w:szCs w:val="56"/>
     </w:rPr>
   </w:style>
-  <w:style w:type="character" w:customStyle="1" w:styleId="Heading2Char">
+  <w:style w:type="character" w:styleId="Heading2Char" w:customStyle="1">
     <w:name w:val="Heading 2 Char"/>
     <w:basedOn w:val="DefaultParagraphFont"/>
     <w:link w:val="Heading2"/>
     <w:uiPriority w:val="9"/>
     <w:rsid w:val="00FF76FE"/>
     <w:rPr>
-      <w:rFonts w:asciiTheme="majorHAnsi" w:eastAsiaTheme="majorEastAsia" w:hAnsiTheme="majorHAnsi" w:cstheme="majorBidi"/>
+      <w:rFonts w:asciiTheme="majorHAnsi" w:hAnsiTheme="majorHAnsi" w:eastAsiaTheme="majorEastAsia" w:cstheme="majorBidi"/>
       <w:color w:val="2F5496" w:themeColor="accent1" w:themeShade="BF"/>
       <w:sz w:val="26"/>
       <w:szCs w:val="26"/>
@@ -6291,7 +6233,7 @@
 </file>
 
 <file path=word/theme/theme1.xml><?xml version="1.0" encoding="utf-8"?>
-<a:theme xmlns:a="http://schemas.openxmlformats.org/drawingml/2006/main" name="Office Theme">
+<a:theme xmlns:a="http://schemas.openxmlformats.org/drawingml/2006/main" xmlns:thm15="http://schemas.microsoft.com/office/thememl/2012/main" name="Office Theme">
   <a:themeElements>
     <a:clrScheme name="Office">
       <a:dk1>
@@ -6552,8 +6494,8 @@
 </file>
 
 <file path=customXml/item1.xml><?xml version="1.0" encoding="utf-8"?>
-<ct:contentTypeSchema xmlns:ct="http://schemas.microsoft.com/office/2006/metadata/contentType" xmlns:ma="http://schemas.microsoft.com/office/2006/metadata/properties/metaAttributes" ct:_="" ma:_="" ma:contentTypeName="Document" ma:contentTypeID="0x01010069F3779B66BC3F4DAB5120B5380EDEF8" ma:contentTypeVersion="18" ma:contentTypeDescription="Create a new document." ma:contentTypeScope="" ma:versionID="b8cbbc459aadea2f4567da3449623fb4">
-  <xsd:schema xmlns:xsd="http://www.w3.org/2001/XMLSchema" xmlns:xs="http://www.w3.org/2001/XMLSchema" xmlns:p="http://schemas.microsoft.com/office/2006/metadata/properties" xmlns:ns2="34cc328e-f486-4d73-9163-9d26e8cf8d6e" xmlns:ns3="686c71fa-6862-4526-b774-d8add1c96eee" targetNamespace="http://schemas.microsoft.com/office/2006/metadata/properties" ma:root="true" ma:fieldsID="acfa781aaebca2a615833601c5c2a0c3" ns2:_="" ns3:_="">
+<ct:contentTypeSchema xmlns:ct="http://schemas.microsoft.com/office/2006/metadata/contentType" xmlns:ma="http://schemas.microsoft.com/office/2006/metadata/properties/metaAttributes" ct:_="" ma:_="" ma:contentTypeName="Document" ma:contentTypeID="0x01010069F3779B66BC3F4DAB5120B5380EDEF8" ma:contentTypeVersion="18" ma:contentTypeDescription="Create a new document." ma:contentTypeScope="" ma:versionID="8ae092d07ffbfac35db9a706e6a16320">
+  <xsd:schema xmlns:xsd="http://www.w3.org/2001/XMLSchema" xmlns:xs="http://www.w3.org/2001/XMLSchema" xmlns:p="http://schemas.microsoft.com/office/2006/metadata/properties" xmlns:ns2="34cc328e-f486-4d73-9163-9d26e8cf8d6e" xmlns:ns3="686c71fa-6862-4526-b774-d8add1c96eee" targetNamespace="http://schemas.microsoft.com/office/2006/metadata/properties" ma:root="true" ma:fieldsID="def645eeacd6dc86ff9e2f96a401f5c2" ns2:_="" ns3:_="">
     <xsd:import namespace="34cc328e-f486-4d73-9163-9d26e8cf8d6e"/>
     <xsd:import namespace="686c71fa-6862-4526-b774-d8add1c96eee"/>
     <xsd:element name="properties">
@@ -6821,7 +6763,7 @@
 </file>
 
 <file path=customXml/itemProps1.xml><?xml version="1.0" encoding="utf-8"?>
-<ds:datastoreItem xmlns:ds="http://schemas.openxmlformats.org/officeDocument/2006/customXml" ds:itemID="{6C21123D-E318-45AC-AAB1-5F20427508DD}"/>
+<ds:datastoreItem xmlns:ds="http://schemas.openxmlformats.org/officeDocument/2006/customXml" ds:itemID="{A96F37D1-B249-4840-8186-617E99EBD30E}"/>
 </file>
 
 <file path=customXml/itemProps2.xml><?xml version="1.0" encoding="utf-8"?>

</xml_diff>